<commit_message>
Neue Laufzettel + Links auf Routenplaner
</commit_message>
<xml_diff>
--- a/extras/Laufzettel_Bueze.docx
+++ b/extras/Laufzettel_Bueze.docx
@@ -13,8 +13,7 @@
       <w:tblGrid>
         <w:gridCol w:w="2127"/>
         <w:gridCol w:w="4111"/>
-        <w:gridCol w:w="708"/>
-        <w:gridCol w:w="2122"/>
+        <w:gridCol w:w="2830"/>
         <w:gridCol w:w="1422"/>
       </w:tblGrid>
       <w:tr>
@@ -48,7 +47,6 @@
         <w:tc>
           <w:tcPr>
             <w:tcW w:w="2830" w:type="dxa"/>
-            <w:gridSpan w:val="2"/>
             <w:tcBorders>
               <w:left w:val="nil"/>
               <w:bottom w:val="single" w:sz="4" w:space="0" w:color="auto"/>
@@ -201,7 +199,7 @@
         <w:tc>
           <w:tcPr>
             <w:tcW w:w="10490" w:type="dxa"/>
-            <w:gridSpan w:val="5"/>
+            <w:gridSpan w:val="4"/>
             <w:tcBorders>
               <w:bottom w:val="nil"/>
             </w:tcBorders>
@@ -321,7 +319,7 @@
         <w:tc>
           <w:tcPr>
             <w:tcW w:w="8363" w:type="dxa"/>
-            <w:gridSpan w:val="4"/>
+            <w:gridSpan w:val="3"/>
             <w:tcBorders>
               <w:top w:val="nil"/>
               <w:left w:val="nil"/>
@@ -395,7 +393,7 @@
         <w:tc>
           <w:tcPr>
             <w:tcW w:w="8363" w:type="dxa"/>
-            <w:gridSpan w:val="4"/>
+            <w:gridSpan w:val="3"/>
             <w:tcBorders>
               <w:top w:val="nil"/>
               <w:left w:val="nil"/>
@@ -438,7 +436,7 @@
         <w:tc>
           <w:tcPr>
             <w:tcW w:w="10490" w:type="dxa"/>
-            <w:gridSpan w:val="5"/>
+            <w:gridSpan w:val="4"/>
           </w:tcPr>
           <w:p>
             <w:pPr>
@@ -666,6 +664,41 @@
           </w:p>
         </w:tc>
       </w:tr>
+    </w:tbl>
+    <w:p>
+      <w:pPr>
+        <w:pStyle w:val="Fuzeile"/>
+        <w:jc w:val="right"/>
+        <w:rPr>
+          <w:b/>
+          <w:bCs/>
+          <w:sz w:val="36"/>
+          <w:szCs w:val="36"/>
+        </w:rPr>
+      </w:pPr>
+      <w:r>
+        <w:rPr>
+          <w:b/>
+          <w:bCs/>
+          <w:sz w:val="36"/>
+          <w:szCs w:val="36"/>
+        </w:rPr>
+        <w:t>Bitte auf Rückseite unterschreiben</w:t>
+      </w:r>
+    </w:p>
+    <w:p/>
+    <w:tbl>
+      <w:tblPr>
+        <w:tblStyle w:val="Tabellenraster"/>
+        <w:tblW w:w="10490" w:type="dxa"/>
+        <w:tblInd w:w="-714" w:type="dxa"/>
+        <w:tblLayout w:type="fixed"/>
+        <w:tblLook w:val="0600" w:firstRow="0" w:lastRow="0" w:firstColumn="0" w:lastColumn="0" w:noHBand="1" w:noVBand="1"/>
+      </w:tblPr>
+      <w:tblGrid>
+        <w:gridCol w:w="6946"/>
+        <w:gridCol w:w="3544"/>
+      </w:tblGrid>
       <w:tr>
         <w:trPr>
           <w:trHeight w:hRule="exact" w:val="2063"/>
@@ -673,7 +706,7 @@
         <w:tc>
           <w:tcPr>
             <w:tcW w:w="10490" w:type="dxa"/>
-            <w:gridSpan w:val="5"/>
+            <w:gridSpan w:val="2"/>
           </w:tcPr>
           <w:p>
             <w:pPr>
@@ -923,7 +956,6 @@
         <w:tc>
           <w:tcPr>
             <w:tcW w:w="6946" w:type="dxa"/>
-            <w:gridSpan w:val="3"/>
           </w:tcPr>
           <w:p>
             <w:pPr>
@@ -1284,7 +1316,6 @@
         <w:tc>
           <w:tcPr>
             <w:tcW w:w="3544" w:type="dxa"/>
-            <w:gridSpan w:val="2"/>
           </w:tcPr>
           <w:p>
             <w:pPr>
@@ -1506,7 +1537,7 @@
         <w:tc>
           <w:tcPr>
             <w:tcW w:w="10490" w:type="dxa"/>
-            <w:gridSpan w:val="5"/>
+            <w:gridSpan w:val="2"/>
           </w:tcPr>
           <w:p>
             <w:pPr>
@@ -1530,104 +1561,65 @@
           </w:p>
         </w:tc>
       </w:tr>
-      <w:tr>
-        <w:trPr>
-          <w:trHeight w:val="548"/>
-        </w:trPr>
-        <w:tc>
-          <w:tcPr>
-            <w:tcW w:w="10490" w:type="dxa"/>
-            <w:gridSpan w:val="5"/>
-          </w:tcPr>
-          <w:p>
-            <w:pPr>
-              <w:tabs>
-                <w:tab w:val="left" w:pos="3861"/>
-              </w:tabs>
-              <w:rPr>
-                <w:sz w:val="28"/>
-                <w:szCs w:val="28"/>
-              </w:rPr>
-            </w:pPr>
-            <w:r>
-              <w:rPr>
-                <w:sz w:val="28"/>
-                <w:szCs w:val="28"/>
-              </w:rPr>
-              <w:t>Ausrichter des Repair Cafés:</w:t>
-            </w:r>
-            <w:r>
-              <w:rPr>
-                <w:sz w:val="28"/>
-                <w:szCs w:val="28"/>
-              </w:rPr>
-              <w:tab/>
-            </w:r>
-            <w:r>
-              <w:rPr>
-                <w:rFonts w:ascii="Arial" w:hAnsi="Arial" w:cs="Arial"/>
-                <w:color w:val="252525"/>
-                <w:shd w:val="clear" w:color="auto" w:fill="FFFFFF"/>
-              </w:rPr>
-              <w:t>Bürgerzentrum Ehrenfeld e.V</w:t>
-            </w:r>
-            <w:r>
-              <w:rPr>
-                <w:rFonts w:ascii="Arial" w:hAnsi="Arial" w:cs="Arial"/>
-                <w:color w:val="252525"/>
-                <w:shd w:val="clear" w:color="auto" w:fill="FFFFFF"/>
-              </w:rPr>
-              <w:t xml:space="preserve">.   </w:t>
-            </w:r>
-            <w:r>
-              <w:rPr>
-                <w:rFonts w:ascii="Arial" w:hAnsi="Arial" w:cs="Arial"/>
-                <w:color w:val="252525"/>
-                <w:shd w:val="clear" w:color="auto" w:fill="FFFFFF"/>
-              </w:rPr>
-              <w:t>Venloer Straße</w:t>
-            </w:r>
-            <w:r>
-              <w:rPr>
-                <w:rFonts w:ascii="Arial" w:hAnsi="Arial" w:cs="Arial"/>
-                <w:color w:val="252525"/>
-                <w:shd w:val="clear" w:color="auto" w:fill="FFFFFF"/>
-              </w:rPr>
-              <w:t xml:space="preserve"> 429   50825 Köln</w:t>
-            </w:r>
-          </w:p>
-        </w:tc>
-      </w:tr>
     </w:tbl>
     <w:p>
       <w:pPr>
-        <w:pStyle w:val="Fuzeile"/>
-        <w:jc w:val="right"/>
-        <w:rPr>
-          <w:b/>
-          <w:bCs/>
-          <w:sz w:val="36"/>
-          <w:szCs w:val="36"/>
-        </w:rPr>
-      </w:pPr>
-      <w:r>
-        <w:rPr>
-          <w:b/>
-          <w:bCs/>
-          <w:sz w:val="36"/>
-          <w:szCs w:val="36"/>
-        </w:rPr>
-        <w:t>Bitte auf Rückseite unterschreiben</w:t>
+        <w:spacing w:before="240" w:after="0" w:line="240" w:lineRule="auto"/>
+        <w:ind w:left="-709" w:right="-142"/>
+      </w:pPr>
+      <w:r>
+        <w:rPr>
+          <w:sz w:val="28"/>
+          <w:szCs w:val="28"/>
+        </w:rPr>
+        <w:t>Ausrichter des Repair Cafés:</w:t>
+      </w:r>
+      <w:r>
+        <w:rPr>
+          <w:sz w:val="28"/>
+          <w:szCs w:val="28"/>
+        </w:rPr>
+        <w:tab/>
+      </w:r>
+      <w:r>
+        <w:rPr>
+          <w:rFonts w:ascii="Arial" w:hAnsi="Arial" w:cs="Arial"/>
+          <w:color w:val="252525"/>
+          <w:shd w:val="clear" w:color="auto" w:fill="FFFFFF"/>
+        </w:rPr>
+        <w:t>Bürgerzentrum Ehrenfeld e.V</w:t>
+      </w:r>
+      <w:r>
+        <w:rPr>
+          <w:rFonts w:ascii="Arial" w:hAnsi="Arial" w:cs="Arial"/>
+          <w:color w:val="252525"/>
+          <w:shd w:val="clear" w:color="auto" w:fill="FFFFFF"/>
+        </w:rPr>
+        <w:t xml:space="preserve">.   </w:t>
+      </w:r>
+      <w:r>
+        <w:rPr>
+          <w:rFonts w:ascii="Arial" w:hAnsi="Arial" w:cs="Arial"/>
+          <w:color w:val="252525"/>
+          <w:shd w:val="clear" w:color="auto" w:fill="FFFFFF"/>
+        </w:rPr>
+        <w:t>Venloer Straße</w:t>
+      </w:r>
+      <w:r>
+        <w:rPr>
+          <w:rFonts w:ascii="Arial" w:hAnsi="Arial" w:cs="Arial"/>
+          <w:color w:val="252525"/>
+          <w:shd w:val="clear" w:color="auto" w:fill="FFFFFF"/>
+        </w:rPr>
+        <w:t xml:space="preserve"> 429   50825 Köln</w:t>
+      </w:r>
+      <w:r>
+        <w:t xml:space="preserve"> </w:t>
       </w:r>
     </w:p>
     <w:p>
       <w:pPr>
-        <w:spacing w:after="0" w:line="240" w:lineRule="auto"/>
-        <w:ind w:left="-284" w:right="-142"/>
-        <w:rPr>
-          <w:sz w:val="72"/>
-          <w:szCs w:val="72"/>
-        </w:rPr>
+        <w:ind w:left="-284"/>
       </w:pPr>
       <w:r>
         <w:br w:type="page"/>
@@ -1638,7 +1630,7 @@
         </w:rPr>
         <w:lastRenderedPageBreak/>
         <w:drawing>
-          <wp:anchor distT="0" distB="0" distL="114300" distR="114300" simplePos="0" relativeHeight="251659264" behindDoc="0" locked="0" layoutInCell="1" allowOverlap="1" wp14:anchorId="135F2066" wp14:editId="43F2B8F6">
+          <wp:anchor distT="0" distB="0" distL="114300" distR="114300" simplePos="0" relativeHeight="251659264" behindDoc="0" locked="0" layoutInCell="1" allowOverlap="1" wp14:anchorId="135F2066" wp14:editId="64B675C3">
             <wp:simplePos x="0" y="0"/>
             <wp:positionH relativeFrom="margin">
               <wp:posOffset>5320030</wp:posOffset>
@@ -1669,10 +1661,10 @@
                     <pic:cNvPicPr/>
                   </pic:nvPicPr>
                   <pic:blipFill>
-                    <a:blip r:embed="rId7" cstate="print">
+                    <a:blip r:embed="rId7">
                       <a:extLst>
-                        <a:ext uri="{28A0092B-C50C-407E-A947-70E740481C1C}">
-                          <a14:useLocalDpi xmlns:a14="http://schemas.microsoft.com/office/drawing/2010/main" val="0"/>
+                        <a:ext uri="{96DAC541-7B7A-43D3-8B79-37D633B846F1}">
+                          <asvg:svgBlip xmlns:asvg="http://schemas.microsoft.com/office/drawing/2016/SVG/main" r:embed="rId8"/>
                         </a:ext>
                       </a:extLst>
                     </a:blip>
@@ -2468,7 +2460,7 @@
       </w:r>
     </w:p>
     <w:sectPr>
-      <w:footerReference w:type="default" r:id="rId8"/>
+      <w:footerReference w:type="default" r:id="rId9"/>
       <w:pgSz w:w="11906" w:h="16838"/>
       <w:pgMar w:top="851" w:right="707" w:bottom="426" w:left="1417" w:header="708" w:footer="430" w:gutter="0"/>
       <w:cols w:space="708"/>

</xml_diff>